<commit_message>
Separate numbered 600 DPI submission figures
</commit_message>
<xml_diff>
--- a/submission/jpbi_manuscript_package.docx
+++ b/submission/jpbi_manuscript_package.docx
@@ -6042,7 +6042,7 @@
         <w:jc w:val="center"/>
       </w:pPr>
       <w:r>
-        <w:t>Figure 2. Fusion minus expression RMSE across held-out folds.</w:t>
+        <w:t>Figure 2. Modality conflict and fusion-minus-expression error differences.</w:t>
       </w:r>
     </w:p>
     <w:p>
@@ -6052,7 +6052,7 @@
       <w:r>
         <w:drawing>
           <wp:inline xmlns:a="http://schemas.openxmlformats.org/drawingml/2006/main" xmlns:pic="http://schemas.openxmlformats.org/drawingml/2006/picture">
-            <wp:extent cx="5943600" cy="1920240"/>
+            <wp:extent cx="5943600" cy="5760723"/>
             <wp:docPr id="3" name="Picture 3"/>
             <wp:cNvGraphicFramePr>
               <a:graphicFrameLocks noChangeAspect="1"/>
@@ -6061,7 +6061,7 @@
               <a:graphicData uri="http://schemas.openxmlformats.org/drawingml/2006/picture">
                 <pic:pic>
                   <pic:nvPicPr>
-                    <pic:cNvPr id="0" name="composite_validation.png"/>
+                    <pic:cNvPr id="0" name="figure_3a_cross_study_transfer.png"/>
                     <pic:cNvPicPr/>
                   </pic:nvPicPr>
                   <pic:blipFill>
@@ -6073,7 +6073,7 @@
                   <pic:spPr>
                     <a:xfrm>
                       <a:off x="0" y="0"/>
-                      <a:ext cx="5943600" cy="1920240"/>
+                      <a:ext cx="5943600" cy="5760723"/>
                     </a:xfrm>
                     <a:prstGeom prst="rect"/>
                   </pic:spPr>
@@ -6089,7 +6089,101 @@
         <w:jc w:val="center"/>
       </w:pPr>
       <w:r>
-        <w:t>Figure 3. Composite summary of transfer performance, signed fusion deltas, and structured modality availability.</w:t>
+        <w:t>Figure 3A. Cross-study transfer by modality.</w:t>
+      </w:r>
+    </w:p>
+    <w:p>
+      <w:pPr>
+        <w:jc w:val="center"/>
+      </w:pPr>
+      <w:r>
+        <w:drawing>
+          <wp:inline xmlns:a="http://schemas.openxmlformats.org/drawingml/2006/main" xmlns:pic="http://schemas.openxmlformats.org/drawingml/2006/picture">
+            <wp:extent cx="5943600" cy="5760723"/>
+            <wp:docPr id="4" name="Picture 4"/>
+            <wp:cNvGraphicFramePr>
+              <a:graphicFrameLocks noChangeAspect="1"/>
+            </wp:cNvGraphicFramePr>
+            <a:graphic>
+              <a:graphicData uri="http://schemas.openxmlformats.org/drawingml/2006/picture">
+                <pic:pic>
+                  <pic:nvPicPr>
+                    <pic:cNvPr id="0" name="figure_3b_fusion_delta.png"/>
+                    <pic:cNvPicPr/>
+                  </pic:nvPicPr>
+                  <pic:blipFill>
+                    <a:blip r:embed="rId12"/>
+                    <a:stretch>
+                      <a:fillRect/>
+                    </a:stretch>
+                  </pic:blipFill>
+                  <pic:spPr>
+                    <a:xfrm>
+                      <a:off x="0" y="0"/>
+                      <a:ext cx="5943600" cy="5760723"/>
+                    </a:xfrm>
+                    <a:prstGeom prst="rect"/>
+                  </pic:spPr>
+                </pic:pic>
+              </a:graphicData>
+            </a:graphic>
+          </wp:inline>
+        </w:drawing>
+      </w:r>
+    </w:p>
+    <w:p>
+      <w:pPr>
+        <w:jc w:val="center"/>
+      </w:pPr>
+      <w:r>
+        <w:t>Figure 3B. Fusion-minus-expression RMSE by held-out split.</w:t>
+      </w:r>
+    </w:p>
+    <w:p>
+      <w:pPr>
+        <w:jc w:val="center"/>
+      </w:pPr>
+      <w:r>
+        <w:drawing>
+          <wp:inline xmlns:a="http://schemas.openxmlformats.org/drawingml/2006/main" xmlns:pic="http://schemas.openxmlformats.org/drawingml/2006/picture">
+            <wp:extent cx="5943600" cy="5760723"/>
+            <wp:docPr id="5" name="Picture 5"/>
+            <wp:cNvGraphicFramePr>
+              <a:graphicFrameLocks noChangeAspect="1"/>
+            </wp:cNvGraphicFramePr>
+            <a:graphic>
+              <a:graphicData uri="http://schemas.openxmlformats.org/drawingml/2006/picture">
+                <pic:pic>
+                  <pic:nvPicPr>
+                    <pic:cNvPr id="0" name="figure_3c_modality_availability.png"/>
+                    <pic:cNvPicPr/>
+                  </pic:nvPicPr>
+                  <pic:blipFill>
+                    <a:blip r:embed="rId13"/>
+                    <a:stretch>
+                      <a:fillRect/>
+                    </a:stretch>
+                  </pic:blipFill>
+                  <pic:spPr>
+                    <a:xfrm>
+                      <a:off x="0" y="0"/>
+                      <a:ext cx="5943600" cy="5760723"/>
+                    </a:xfrm>
+                    <a:prstGeom prst="rect"/>
+                  </pic:spPr>
+                </pic:pic>
+              </a:graphicData>
+            </a:graphic>
+          </wp:inline>
+        </w:drawing>
+      </w:r>
+    </w:p>
+    <w:p>
+      <w:pPr>
+        <w:jc w:val="center"/>
+      </w:pPr>
+      <w:r>
+        <w:t>Figure 3C. Outer-join modality availability.</w:t>
       </w:r>
     </w:p>
     <w:p>

</xml_diff>

<commit_message>
Fix centered individual manuscript figures
</commit_message>
<xml_diff>
--- a/submission/jpbi_manuscript_package.docx
+++ b/submission/jpbi_manuscript_package.docx
@@ -5953,12 +5953,13 @@
     </w:p>
     <w:p>
       <w:pPr>
+        <w:ind w:left="0" w:right="0"/>
         <w:jc w:val="center"/>
       </w:pPr>
       <w:r>
         <w:drawing>
           <wp:inline xmlns:a="http://schemas.openxmlformats.org/drawingml/2006/main" xmlns:pic="http://schemas.openxmlformats.org/drawingml/2006/picture">
-            <wp:extent cx="5943600" cy="3566160"/>
+            <wp:extent cx="5212080" cy="3127248"/>
             <wp:docPr id="1" name="Picture 1"/>
             <wp:cNvGraphicFramePr>
               <a:graphicFrameLocks noChangeAspect="1"/>
@@ -5979,7 +5980,7 @@
                   <pic:spPr>
                     <a:xfrm>
                       <a:off x="0" y="0"/>
-                      <a:ext cx="5943600" cy="3566160"/>
+                      <a:ext cx="5212080" cy="3127248"/>
                     </a:xfrm>
                     <a:prstGeom prst="rect"/>
                   </pic:spPr>
@@ -5992,6 +5993,7 @@
     </w:p>
     <w:p>
       <w:pPr>
+        <w:ind w:left="0" w:right="0"/>
         <w:jc w:val="center"/>
       </w:pPr>
       <w:r>
@@ -6000,12 +6002,13 @@
     </w:p>
     <w:p>
       <w:pPr>
+        <w:ind w:left="0" w:right="0"/>
         <w:jc w:val="center"/>
       </w:pPr>
       <w:r>
         <w:drawing>
           <wp:inline xmlns:a="http://schemas.openxmlformats.org/drawingml/2006/main" xmlns:pic="http://schemas.openxmlformats.org/drawingml/2006/picture">
-            <wp:extent cx="5943600" cy="3434080"/>
+            <wp:extent cx="5212080" cy="3011424"/>
             <wp:docPr id="2" name="Picture 2"/>
             <wp:cNvGraphicFramePr>
               <a:graphicFrameLocks noChangeAspect="1"/>
@@ -6026,7 +6029,7 @@
                   <pic:spPr>
                     <a:xfrm>
                       <a:off x="0" y="0"/>
-                      <a:ext cx="5943600" cy="3434080"/>
+                      <a:ext cx="5212080" cy="3011424"/>
                     </a:xfrm>
                     <a:prstGeom prst="rect"/>
                   </pic:spPr>
@@ -6039,6 +6042,7 @@
     </w:p>
     <w:p>
       <w:pPr>
+        <w:ind w:left="0" w:right="0"/>
         <w:jc w:val="center"/>
       </w:pPr>
       <w:r>
@@ -6047,12 +6051,13 @@
     </w:p>
     <w:p>
       <w:pPr>
+        <w:ind w:left="0" w:right="0"/>
         <w:jc w:val="center"/>
       </w:pPr>
       <w:r>
         <w:drawing>
           <wp:inline xmlns:a="http://schemas.openxmlformats.org/drawingml/2006/main" xmlns:pic="http://schemas.openxmlformats.org/drawingml/2006/picture">
-            <wp:extent cx="5943600" cy="5760723"/>
+            <wp:extent cx="5212080" cy="5051711"/>
             <wp:docPr id="3" name="Picture 3"/>
             <wp:cNvGraphicFramePr>
               <a:graphicFrameLocks noChangeAspect="1"/>
@@ -6073,7 +6078,7 @@
                   <pic:spPr>
                     <a:xfrm>
                       <a:off x="0" y="0"/>
-                      <a:ext cx="5943600" cy="5760723"/>
+                      <a:ext cx="5212080" cy="5051711"/>
                     </a:xfrm>
                     <a:prstGeom prst="rect"/>
                   </pic:spPr>
@@ -6086,6 +6091,7 @@
     </w:p>
     <w:p>
       <w:pPr>
+        <w:ind w:left="0" w:right="0"/>
         <w:jc w:val="center"/>
       </w:pPr>
       <w:r>
@@ -6094,12 +6100,13 @@
     </w:p>
     <w:p>
       <w:pPr>
+        <w:ind w:left="0" w:right="0"/>
         <w:jc w:val="center"/>
       </w:pPr>
       <w:r>
         <w:drawing>
           <wp:inline xmlns:a="http://schemas.openxmlformats.org/drawingml/2006/main" xmlns:pic="http://schemas.openxmlformats.org/drawingml/2006/picture">
-            <wp:extent cx="5943600" cy="5760723"/>
+            <wp:extent cx="5212080" cy="5051711"/>
             <wp:docPr id="4" name="Picture 4"/>
             <wp:cNvGraphicFramePr>
               <a:graphicFrameLocks noChangeAspect="1"/>
@@ -6120,7 +6127,7 @@
                   <pic:spPr>
                     <a:xfrm>
                       <a:off x="0" y="0"/>
-                      <a:ext cx="5943600" cy="5760723"/>
+                      <a:ext cx="5212080" cy="5051711"/>
                     </a:xfrm>
                     <a:prstGeom prst="rect"/>
                   </pic:spPr>
@@ -6133,6 +6140,7 @@
     </w:p>
     <w:p>
       <w:pPr>
+        <w:ind w:left="0" w:right="0"/>
         <w:jc w:val="center"/>
       </w:pPr>
       <w:r>
@@ -6141,12 +6149,13 @@
     </w:p>
     <w:p>
       <w:pPr>
+        <w:ind w:left="0" w:right="0"/>
         <w:jc w:val="center"/>
       </w:pPr>
       <w:r>
         <w:drawing>
           <wp:inline xmlns:a="http://schemas.openxmlformats.org/drawingml/2006/main" xmlns:pic="http://schemas.openxmlformats.org/drawingml/2006/picture">
-            <wp:extent cx="5943600" cy="5760723"/>
+            <wp:extent cx="5212080" cy="5051711"/>
             <wp:docPr id="5" name="Picture 5"/>
             <wp:cNvGraphicFramePr>
               <a:graphicFrameLocks noChangeAspect="1"/>
@@ -6167,7 +6176,7 @@
                   <pic:spPr>
                     <a:xfrm>
                       <a:off x="0" y="0"/>
-                      <a:ext cx="5943600" cy="5760723"/>
+                      <a:ext cx="5212080" cy="5051711"/>
                     </a:xfrm>
                     <a:prstGeom prst="rect"/>
                   </pic:spPr>
@@ -6180,6 +6189,7 @@
     </w:p>
     <w:p>
       <w:pPr>
+        <w:ind w:left="0" w:right="0"/>
         <w:jc w:val="center"/>
       </w:pPr>
       <w:r>

</xml_diff>